<commit_message>
Integrate OCR and all NLP models into UI
</commit_message>
<xml_diff>
--- a/docs/Components/UI/UI Write up.docx
+++ b/docs/Components/UI/UI Write up.docx
@@ -31,7 +31,15 @@
         <w:jc w:val="both"/>
       </w:pPr>
       <w:r>
-        <w:t>The primary user of PsychExtract is a university student engaging in handwritten self-reflection. This user writes journal entries as a means of processing emotional experiences, academic stressors, interpersonal dynamics, and internal cognitive tensions. While journaling supports expression, extracting structured insight from personal writing can be cognitively demanding, particularly when emotional proximity reduces objectivity. The user therefore seeks a supportive system that can highlight emotional and thematic patterns in a way that feels reflective rather than diagnostic.</w:t>
+        <w:t xml:space="preserve">The primary user of </w:t>
+      </w:r>
+      <w:proofErr w:type="spellStart"/>
+      <w:r>
+        <w:t>PsychExtract</w:t>
+      </w:r>
+      <w:proofErr w:type="spellEnd"/>
+      <w:r>
+        <w:t xml:space="preserve"> is a university student engaging in handwritten self-reflection. This user writes journal entries as a means of processing emotional experiences, academic stressors, interpersonal dynamics, and internal cognitive tensions. While journaling supports expression, extracting structured insight from personal writing can be cognitively demanding, particularly when emotional proximity reduces objectivity. The user therefore seeks a supportive system that can highlight emotional and thematic patterns in a way that feels reflective rather than diagnostic.</w:t>
       </w:r>
     </w:p>
     <w:p>
@@ -83,7 +91,15 @@
         <w:jc w:val="both"/>
       </w:pPr>
       <w:r>
-        <w:t>Crucially, before any emotional or thematic analysis occurs, the extracted text is presented back to the user in an editable format. The user is prompted to review and, if necessary, correct the transcription. Insight extraction is contingent upon explicit user confirmation of the text’s accuracy. This human-in-the-loop verification stage serves multiple purposes. First, it mitigates the risk of OCR errors propagating into downstream NLP analysis. Second, it preserves user agency by ensuring that the system analyzes only text that the user has validated. Third, it supports ethical transparency in the handling of sensitive personal material. In this design, interpretative authority remains shared rather than fully automated.</w:t>
+        <w:t xml:space="preserve">Crucially, before any emotional or thematic analysis occurs, the extracted text is presented back to the user in an editable format. The user is prompted to review and, if necessary, correct the transcription. Insight extraction is contingent upon explicit user confirmation of the text’s accuracy. This human-in-the-loop verification stage serves multiple purposes. First, it mitigates the risk of OCR errors propagating into downstream NLP analysis. Second, it preserves user agency by ensuring that the system </w:t>
+      </w:r>
+      <w:proofErr w:type="spellStart"/>
+      <w:r>
+        <w:t>analyzes</w:t>
+      </w:r>
+      <w:proofErr w:type="spellEnd"/>
+      <w:r>
+        <w:t xml:space="preserve"> only text that the user has validated. Third, it supports ethical transparency in the handling of sensitive personal material. In this design, interpretative authority remains shared rather than fully automated.</w:t>
       </w:r>
     </w:p>
     <w:p>
@@ -149,7 +165,50 @@
         <w:jc w:val="both"/>
       </w:pPr>
       <w:r>
-        <w:t>The human-in-the-loop component is particularly central to the system’s design philosophy. Because PsychExtract operates on personally sensitive narrative material, maintaining user oversight prior to interpretative analysis reinforces responsible AI principles. The system is therefore positioned not as an autonomous evaluator, but as a structured reflective partner that supports user-led meaning-making.</w:t>
+        <w:t xml:space="preserve">The human-in-the-loop component is particularly central to the system’s design philosophy. Because </w:t>
+      </w:r>
+      <w:proofErr w:type="spellStart"/>
+      <w:r>
+        <w:t>PsychExtract</w:t>
+      </w:r>
+      <w:proofErr w:type="spellEnd"/>
+      <w:r>
+        <w:t xml:space="preserve"> operates on personally sensitive narrative material, maintaining user oversight prior to interpretative analysis reinforces responsible AI principles. The system is therefore positioned not as an autonomous evaluator, but as a structured reflective partner that supports user-led meaning-making.</w:t>
+      </w:r>
+    </w:p>
+    <w:p>
+      <w:pPr>
+        <w:pStyle w:val="Heading2"/>
+        <w:numPr>
+          <w:ilvl w:val="0"/>
+          <w:numId w:val="0"/>
+        </w:numPr>
+        <w:ind w:left="576" w:hanging="576"/>
+      </w:pPr>
+      <w:r>
+        <w:t>Implementation</w:t>
+      </w:r>
+    </w:p>
+    <w:p>
+      <w:pPr>
+        <w:jc w:val="both"/>
+      </w:pPr>
+      <w:r>
+        <w:t>The UI layer was deliberately decoupled from the ML pipeline.</w:t>
+      </w:r>
+      <w:r>
+        <w:t xml:space="preserve"> </w:t>
+      </w:r>
+      <w:r>
+        <w:t xml:space="preserve">The </w:t>
+      </w:r>
+      <w:proofErr w:type="spellStart"/>
+      <w:r>
+        <w:t>Streamlit</w:t>
+      </w:r>
+      <w:proofErr w:type="spellEnd"/>
+      <w:r>
+        <w:t xml:space="preserve"> interface acts only as an orchestration layer, while all computational logic resides in modular components.</w:t>
       </w:r>
     </w:p>
     <w:p>
@@ -169,7 +228,23 @@
         <w:jc w:val="both"/>
       </w:pPr>
       <w:r>
-        <w:t>To evaluate the clarity and usability of the PsychExtract interface at an early stage of development, a short-form remote perception survey was conducted. At this stage, the prototype consisted of a Streamlit-based interface with hardcoded outputs. As such, the evaluation focused on surface-level interaction design, conceptual clarity, and user confidence rather than functional correctness or model performance.</w:t>
+        <w:t xml:space="preserve">To evaluate the clarity and usability of the </w:t>
+      </w:r>
+      <w:proofErr w:type="spellStart"/>
+      <w:r>
+        <w:t>PsychExtract</w:t>
+      </w:r>
+      <w:proofErr w:type="spellEnd"/>
+      <w:r>
+        <w:t xml:space="preserve"> interface at an early stage of development, a short-form remote perception survey was conducted. At this stage, the prototype consisted of a </w:t>
+      </w:r>
+      <w:proofErr w:type="spellStart"/>
+      <w:r>
+        <w:t>Streamlit</w:t>
+      </w:r>
+      <w:proofErr w:type="spellEnd"/>
+      <w:r>
+        <w:t>-based interface with hardcoded outputs. As such, the evaluation focused on surface-level interaction design, conceptual clarity, and user confidence rather than functional correctness or model performance.</w:t>
       </w:r>
     </w:p>
     <w:p>
@@ -263,6 +338,7 @@
         <w:jc w:val="both"/>
       </w:pPr>
       <w:r>
+        <w:lastRenderedPageBreak/>
         <w:t>The findings from this evaluation were intended to inform iterative refinements to interface language, layout, and visual feedback mechanisms prior to integrating dynamic model outputs and conducting more comprehensive interactive usability testing.</w:t>
       </w:r>
     </w:p>
@@ -275,7 +351,6 @@
         </w:numPr>
       </w:pPr>
       <w:r>
-        <w:lastRenderedPageBreak/>
         <w:t>Results and Discussion</w:t>
       </w:r>
     </w:p>
@@ -412,7 +487,15 @@
         <w:jc w:val="both"/>
       </w:pPr>
       <w:r>
-        <w:t>The early-stage evaluation indicates that the PsychExtract interface achieves its primary design objective: presenting a transparent, linear, and interpretable reflective workflow. Participants were able to understand the system’s purpose, follow the step-by-step process, and interpret the visual feedback mechanisms with relatively high agreement scores.</w:t>
+        <w:t xml:space="preserve">The early-stage evaluation indicates that the </w:t>
+      </w:r>
+      <w:proofErr w:type="spellStart"/>
+      <w:r>
+        <w:t>PsychExtract</w:t>
+      </w:r>
+      <w:proofErr w:type="spellEnd"/>
+      <w:r>
+        <w:t xml:space="preserve"> interface achieves its primary design objective: presenting a transparent, linear, and interpretable reflective workflow. Participants were able to understand the system’s purpose, follow the step-by-step process, and interpret the visual feedback mechanisms with relatively high agreement scores.</w:t>
       </w:r>
     </w:p>
     <w:p>
@@ -440,6 +523,7 @@
         <w:jc w:val="both"/>
       </w:pPr>
       <w:r>
+        <w:lastRenderedPageBreak/>
         <w:t>Purpose articulation on the landing page should be strengthened. A concise descriptive statement explaining that the system extracts emotional and thematic insights from handwritten journal entries would likely increase perceived clarity and confidence.</w:t>
       </w:r>
     </w:p>
@@ -452,7 +536,6 @@
         <w:jc w:val="both"/>
       </w:pPr>
       <w:r>
-        <w:lastRenderedPageBreak/>
         <w:t xml:space="preserve">Visual layout adjustments </w:t>
       </w:r>
       <w:r>

</xml_diff>